<commit_message>
Reposition resume for GTM AI workflow roles
</commit_message>
<xml_diff>
--- a/portfolio/public/James_Moorman_Resume.docx
+++ b/portfolio/public/James_Moorman_Resume.docx
@@ -12,10 +12,9 @@
     </w:p>
     <w:p>
       <w:r>
-        <w:t>Eden Prairie, MN 55347 | 651-270-4656 | jpmoorman@gmail.com</w:t>
+        <w:t>Eden Prairie, MN | 651-270-4656 | jpmoorman@gmail.com | Portfolio: https://resume-portfolio-7tr.pages.dev | GitHub: https://github.com/jpmoorman/resume-portfolio</w:t>
       </w:r>
     </w:p>
-    <w:p/>
     <w:p>
       <w:pPr>
         <w:pStyle w:val="Heading2"/>
@@ -26,16 +25,15 @@
     </w:p>
     <w:p>
       <w:r>
-        <w:t>AI and operations technology leader with experience building internal software, automation workflows, and data-driven decision systems across manufacturing, quality, distribution, program management, and commercial operations. Hands-on builder of React and Python applications, AI-assisted development workflows, and system integrations that connect CRM-adjacent processes, document control systems, warehouse systems, and operational data platforms. Record of delivering measurable business outcomes through workflow reliability, adoption, and process modernization.</w:t>
+        <w:t>AI workflow engineer and internal tools builder with experience designing, shipping, and scaling AI-enabled workflows across CRM-adjacent processes, operational data, document systems, and internal web applications. Hands-on with React, Python, SQL, APIs, LLM-assisted development, prompt frameworks, and automation patterns. Strong record of moving ambiguous business needs from prototype to production, measuring adoption and impact, and creating reusable patterns that reduce manual work across distributed teams.</w:t>
       </w:r>
     </w:p>
-    <w:p/>
     <w:p>
       <w:pPr>
         <w:pStyle w:val="Heading2"/>
       </w:pPr>
       <w:r>
-        <w:t>Core Competencies</w:t>
+        <w:t>Core Skills</w:t>
       </w:r>
     </w:p>
     <w:p>
@@ -43,7 +41,7 @@
         <w:pStyle w:val="ListBullet"/>
       </w:pPr>
       <w:r>
-        <w:t>AI Workflow Engineering: LLM-assisted development, prompt frameworks, reusable implementation patterns, workflow automation, decision-support tooling</w:t>
+        <w:t>AI Workflow Engineering: LLM-assisted development, prompt frameworks, agent-style workflows, AI quality checks, reusable automation patterns</w:t>
       </w:r>
     </w:p>
     <w:p>
@@ -51,7 +49,7 @@
         <w:pStyle w:val="ListBullet"/>
       </w:pPr>
       <w:r>
-        <w:t>Software Engineering: React, Python, APIs, internal web applications, service patterns, validation logic, production workflow tooling</w:t>
+        <w:t>Internal Tools: React, Python, APIs, SQL, dashboards, workflow applications, validation logic</w:t>
       </w:r>
     </w:p>
     <w:p>
@@ -59,7 +57,7 @@
         <w:pStyle w:val="ListBullet"/>
       </w:pPr>
       <w:r>
-        <w:t>Data and Analytics: SQL, Microsoft Dataverse, Azure Cosmos DB, dashboards, reporting automation, operational analytics</w:t>
+        <w:t>GTM / CRM Systems: Salesforce-adjacent workflows, CRM-connected processes, order workflows, reporting automation, adoption tracking</w:t>
       </w:r>
     </w:p>
     <w:p>
@@ -67,7 +65,7 @@
         <w:pStyle w:val="ListBullet"/>
       </w:pPr>
       <w:r>
-        <w:t>GTM and Operations Systems: Salesforce-adjacent workflows, document control systems, warehouse and manufacturing systems, approval workflows</w:t>
+        <w:t>Data Platforms: SQL, Microsoft Dataverse, Azure Cosmos DB, Microsoft Fabric concepts, Power BI, Power Platform</w:t>
       </w:r>
     </w:p>
     <w:p>
@@ -75,10 +73,57 @@
         <w:pStyle w:val="ListBullet"/>
       </w:pPr>
       <w:r>
-        <w:t>Leadership and Execution: Cross-functional delivery, stakeholder alignment, program execution, adoption tracking, executive reporting</w:t>
+        <w:t>Execution: Stakeholder discovery, prototype-to-production delivery, rollout planning, executive reporting, business-impact measurement</w:t>
       </w:r>
     </w:p>
-    <w:p/>
+    <w:p>
+      <w:pPr>
+        <w:pStyle w:val="Heading2"/>
+      </w:pPr>
+      <w:r>
+        <w:t>Best Fit for Sales AI Engineering</w:t>
+      </w:r>
+    </w:p>
+    <w:p>
+      <w:pPr>
+        <w:pStyle w:val="ListBullet"/>
+      </w:pPr>
+      <w:r>
+        <w:t>Built internal workflow tools that reduced manual execution across sales-adjacent, operations, quality, warehouse, and document-control processes.</w:t>
+      </w:r>
+    </w:p>
+    <w:p>
+      <w:pPr>
+        <w:pStyle w:val="ListBullet"/>
+      </w:pPr>
+      <w:r>
+        <w:t>Connected fragmented systems using APIs, SQL, Python, React, Power Platform, Dataverse, Cosmos DB, and custom web tools.</w:t>
+      </w:r>
+    </w:p>
+    <w:p>
+      <w:pPr>
+        <w:pStyle w:val="ListBullet"/>
+      </w:pPr>
+      <w:r>
+        <w:t>Used AI-assisted development tools including OpenAI Codex, Claude Code, OpenCode, Windsurf, and GitHub Copilot to accelerate prototype-to-production delivery.</w:t>
+      </w:r>
+    </w:p>
+    <w:p>
+      <w:pPr>
+        <w:pStyle w:val="ListBullet"/>
+      </w:pPr>
+      <w:r>
+        <w:t>Created reusable implementation patterns for internal tools, dashboards, validation logic, and workflow automation.</w:t>
+      </w:r>
+    </w:p>
+    <w:p>
+      <w:pPr>
+        <w:pStyle w:val="ListBullet"/>
+      </w:pPr>
+      <w:r>
+        <w:t>Measured business impact through adoption, accuracy, throughput, cycle time, cost reduction, and executive-level operating metrics.</w:t>
+      </w:r>
+    </w:p>
     <w:p>
       <w:pPr>
         <w:pStyle w:val="Heading2"/>
@@ -87,7 +132,6 @@
         <w:t>Professional Experience</w:t>
       </w:r>
     </w:p>
-    <w:p/>
     <w:p>
       <w:pPr>
         <w:pStyle w:val="Heading3"/>
@@ -98,7 +142,7 @@
     </w:p>
     <w:p>
       <w:r>
-        <w:t>**Senior Manager, AI-Accelerated Software Development and Operations Technology** (Previously Program Manager)</w:t>
+        <w:t>Senior Manager, AI Workflow Engineering and Internal Tools</w:t>
       </w:r>
     </w:p>
     <w:p>
@@ -106,13 +150,12 @@
         <w:t>09/2022 - Present</w:t>
       </w:r>
     </w:p>
-    <w:p/>
     <w:p>
       <w:pPr>
         <w:pStyle w:val="ListBullet"/>
       </w:pPr>
       <w:r>
-        <w:t>Lead development of internal software, AI-enabled workflows, dashboards, and integrations across manufacturing, quality, distribution, program management, and commercial operations.</w:t>
+        <w:t>Designed and shipped AI-enabled internal tools, workflow automations, dashboards, and system integrations across commercial operations, manufacturing, quality, distribution, and program execution.</w:t>
       </w:r>
     </w:p>
     <w:p>
@@ -120,7 +163,7 @@
         <w:pStyle w:val="ListBullet"/>
       </w:pPr>
       <w:r>
-        <w:t>Built unified internal software experiences using React front ends and Python back ends, with reusable interface and service patterns across workflow tools.</w:t>
+        <w:t>Built React and Python applications that connected CRM-connected workflows, warehouse systems, document-control systems, SQL, Dataverse, Cosmos DB, APIs, and custom operational tools.</w:t>
       </w:r>
     </w:p>
     <w:p>
@@ -128,7 +171,7 @@
         <w:pStyle w:val="ListBullet"/>
       </w:pPr>
       <w:r>
-        <w:t>Connected Salesforce-adjacent workflows, warehouse systems, document control systems, Dataverse, Cosmos DB, SQL, APIs, and custom web tools to reduce fragmented process execution.</w:t>
+        <w:t>Replaced Excel-heavy workflows with centralized data models, shared dashboards, and production workflow applications.</w:t>
       </w:r>
     </w:p>
     <w:p>
@@ -136,7 +179,7 @@
         <w:pStyle w:val="ListBullet"/>
       </w:pPr>
       <w:r>
-        <w:t>Replaced Excel-heavy operating processes with centralized data models, shared dashboards, and workflow applications.</w:t>
+        <w:t>Applied LLM-assisted development workflows using OpenAI Codex, Claude Code, OpenCode, Windsurf, and GitHub Copilot to accelerate internal software delivery.</w:t>
       </w:r>
     </w:p>
     <w:p>
@@ -144,7 +187,7 @@
         <w:pStyle w:val="ListBullet"/>
       </w:pPr>
       <w:r>
-        <w:t>Partner with operations, quality, IT, engineering, sales support, and executive leadership to define requirements, deploy solutions, and measure adoption.</w:t>
+        <w:t>Created reusable interface, service, validation, and automation patterns that allowed multiple internal tools to scale from prototype to operational use.</w:t>
       </w:r>
     </w:p>
     <w:p>
@@ -152,13 +195,7 @@
         <w:pStyle w:val="ListBullet"/>
       </w:pPr>
       <w:r>
-        <w:t>Present weekly execution and risk updates to C-suite leadership.</w:t>
-      </w:r>
-    </w:p>
-    <w:p/>
-    <w:p>
-      <w:r>
-        <w:t>**Selected Outcomes**</w:t>
+        <w:t>Partnered with operations, quality, IT, engineering, sales support, and executive leadership to define requirements, deploy solutions, govern rollout, and measure adoption.</w:t>
       </w:r>
     </w:p>
     <w:p>
@@ -166,7 +203,20 @@
         <w:pStyle w:val="ListBullet"/>
       </w:pPr>
       <w:r>
-        <w:t>Improved order accuracy from 97% to 99.7% in 3 months through custom warehouse workflow tooling.</w:t>
+        <w:t>Presented weekly execution, risk, adoption, and business-impact updates to C-suite leadership.</w:t>
+      </w:r>
+    </w:p>
+    <w:p>
+      <w:r>
+        <w:t>Selected Outcomes</w:t>
+      </w:r>
+    </w:p>
+    <w:p>
+      <w:pPr>
+        <w:pStyle w:val="ListBullet"/>
+      </w:pPr>
+      <w:r>
+        <w:t>Improved order accuracy from 97% to 99.7% in 3 months through warehouse workflow tooling.</w:t>
       </w:r>
     </w:p>
     <w:p>
@@ -182,7 +232,15 @@
         <w:pStyle w:val="ListBullet"/>
       </w:pPr>
       <w:r>
-        <w:t>Reduced overhead costs by $2.2M annually and identified approximately $634k annual incorrect-order overnight shipping exposure.</w:t>
+        <w:t>Reduced annual overhead costs by $2.2M through process automation and workflow modernization.</w:t>
+      </w:r>
+    </w:p>
+    <w:p>
+      <w:pPr>
+        <w:pStyle w:val="ListBullet"/>
+      </w:pPr>
+      <w:r>
+        <w:t>Identified approximately $634K in annual incorrect-order overnight shipping exposure.</w:t>
       </w:r>
     </w:p>
     <w:p>
@@ -202,17 +260,8 @@
       </w:r>
     </w:p>
     <w:p>
-      <w:pPr>
-        <w:pStyle w:val="ListBullet"/>
-      </w:pPr>
       <w:r>
-        <w:t>Built reusable AI and automation implementation patterns for moving from prototype to operational workflow tools.</w:t>
-      </w:r>
-    </w:p>
-    <w:p/>
-    <w:p>
-      <w:r>
-        <w:t>**Representative Systems Delivered**</w:t>
+        <w:t>Representative Systems Delivered</w:t>
       </w:r>
     </w:p>
     <w:p>
@@ -220,7 +269,7 @@
         <w:pStyle w:val="ListBullet"/>
       </w:pPr>
       <w:r>
-        <w:t>Warehouse management and correction dashboards integrating pick, routing, and fulfillment workflows.</w:t>
+        <w:t>CRM-adjacent workflow tooling: Built workflow tools that connected order, customer, fulfillment, and reporting processes outside the core CRM system.</w:t>
       </w:r>
     </w:p>
     <w:p>
@@ -228,7 +277,7 @@
         <w:pStyle w:val="ListBullet"/>
       </w:pPr>
       <w:r>
-        <w:t>Controlled-access document viewer for approved source-document access in production environments, reducing licensing costs across multiple applications.</w:t>
+        <w:t>Warehouse execution dashboards: Integrated pick, routing, correction, and fulfillment workflows to improve order accuracy and shipment throughput.</w:t>
       </w:r>
     </w:p>
     <w:p>
@@ -236,7 +285,7 @@
         <w:pStyle w:val="ListBullet"/>
       </w:pPr>
       <w:r>
-        <w:t>Electronic traveler workflow for injection molding with job-to-document traceability.</w:t>
+        <w:t>Controlled document viewer: Built a controlled-access web viewer for approved production documents, reducing licensing friction and improving source-document access.</w:t>
       </w:r>
     </w:p>
     <w:p>
@@ -244,7 +293,7 @@
         <w:pStyle w:val="ListBullet"/>
       </w:pPr>
       <w:r>
-        <w:t>MES-style manufacturing execution workflows improving visibility, traceability, and operational control.</w:t>
+        <w:t>Electronic traveler workflow: Created job-to-document traceability tools for manufacturing execution and compliance workflows.</w:t>
       </w:r>
     </w:p>
     <w:p>
@@ -252,10 +301,9 @@
         <w:pStyle w:val="ListBullet"/>
       </w:pPr>
       <w:r>
-        <w:t>Program and project management tooling on Power Platform and Dataverse with automated leadership reporting.</w:t>
+        <w:t>Leadership reporting automation: Built Power Platform and Dataverse tools that automated project and program reporting for executive updates.</w:t>
       </w:r>
     </w:p>
-    <w:p/>
     <w:p>
       <w:pPr>
         <w:pStyle w:val="Heading3"/>
@@ -266,7 +314,7 @@
     </w:p>
     <w:p>
       <w:r>
-        <w:t>**Senior Engineer / Documentation Systems Lead**</w:t>
+        <w:t>Senior Engineer / Documentation Systems Lead</w:t>
       </w:r>
     </w:p>
     <w:p>
@@ -274,7 +322,6 @@
         <w:t>12/2020 - 08/2022</w:t>
       </w:r>
     </w:p>
-    <w:p/>
     <w:p>
       <w:pPr>
         <w:pStyle w:val="ListBullet"/>
@@ -307,21 +354,14 @@
         <w:t>Managed product delivery from concept through launch with timeline, budget, quality, and regulatory alignment.</w:t>
       </w:r>
     </w:p>
-    <w:p/>
-    <w:p>
-      <w:r>
-        <w:t>**Selected Outcomes**</w:t>
-      </w:r>
-    </w:p>
     <w:p>
       <w:pPr>
         <w:pStyle w:val="ListBullet"/>
       </w:pPr>
       <w:r>
-        <w:t>Supported launch generating approximately $25k in weekly revenue and 2,600 units sold in the first year.</w:t>
+        <w:t>Supported launch generating approximately $25K in weekly revenue and 2,600 units sold in the first year.</w:t>
       </w:r>
     </w:p>
-    <w:p/>
     <w:p>
       <w:pPr>
         <w:pStyle w:val="Heading3"/>
@@ -332,7 +372,7 @@
     </w:p>
     <w:p>
       <w:r>
-        <w:t>**Product Manager**</w:t>
+        <w:t>Product Manager</w:t>
       </w:r>
     </w:p>
     <w:p>
@@ -340,7 +380,6 @@
         <w:t>02/2018 - 12/2020</w:t>
       </w:r>
     </w:p>
-    <w:p/>
     <w:p>
       <w:pPr>
         <w:pStyle w:val="ListBullet"/>
@@ -381,7 +420,6 @@
         <w:t>Presented nationally on battery longevity and safety in electric vehicle contexts.</w:t>
       </w:r>
     </w:p>
-    <w:p/>
     <w:p>
       <w:pPr>
         <w:pStyle w:val="Heading3"/>
@@ -392,7 +430,7 @@
     </w:p>
     <w:p>
       <w:r>
-        <w:t>**Product Development Consultant**</w:t>
+        <w:t>Product Development Consultant</w:t>
       </w:r>
     </w:p>
     <w:p>
@@ -400,7 +438,6 @@
         <w:t>08/2011 - 02/2018</w:t>
       </w:r>
     </w:p>
-    <w:p/>
     <w:p>
       <w:pPr>
         <w:pStyle w:val="ListBullet"/>
@@ -425,7 +462,6 @@
         <w:t>Supported clients in medical, industrial, consumer, and commercial segments on manufacturability, usability, and product-market fit.</w:t>
       </w:r>
     </w:p>
-    <w:p/>
     <w:p>
       <w:pPr>
         <w:pStyle w:val="Heading2"/>
@@ -450,7 +486,6 @@
         <w:t>BS, Mechanical Engineering - University of St. Thomas, Saint Paul, MN</w:t>
       </w:r>
     </w:p>
-    <w:p/>
     <w:p>
       <w:pPr>
         <w:pStyle w:val="Heading2"/>
@@ -464,7 +499,7 @@
         <w:pStyle w:val="ListBullet"/>
       </w:pPr>
       <w:r>
-        <w:t>AI and Developer Tools: OpenAI Codex, Claude Code, OpenCode, Windsurf, GitHub Copilot, prompt frameworks, agent-style workflows</w:t>
+        <w:t>AI and Developer Tools: OpenAI Codex, Claude Code, OpenCode, Windsurf, GitHub Copilot, prompt frameworks, agent-style workflows, LLM quality checks</w:t>
       </w:r>
     </w:p>
     <w:p>
@@ -488,7 +523,7 @@
         <w:pStyle w:val="ListBullet"/>
       </w:pPr>
       <w:r>
-        <w:t>Automation and Workflow: Power Apps, Power Automate, approval workflows, document review support, workflow tracking</w:t>
+        <w:t>Automation and Workflow: Power Apps, Power Automate, approval workflows, document review support, reporting automation, workflow tracking</w:t>
       </w:r>
     </w:p>
     <w:p>
@@ -496,7 +531,15 @@
         <w:pStyle w:val="ListBullet"/>
       </w:pPr>
       <w:r>
-        <w:t>Systems and Domains: Salesforce-adjacent workflows, warehouse systems, pick-to-light, manufacturing systems, document control, Windchill, Grand Avenue, MediaWiki</w:t>
+        <w:t>GTM and Business Systems: Salesforce-adjacent workflows, CRM hygiene, CRM-connected processes, account/order insights, commercial workflow systems, sales support workflows</w:t>
+      </w:r>
+    </w:p>
+    <w:p>
+      <w:pPr>
+        <w:pStyle w:val="ListBullet"/>
+      </w:pPr>
+      <w:r>
+        <w:t>Operational Systems: Warehouse systems, pick-to-light, manufacturing systems, document control, Windchill, Grand Avenue, MediaWiki</w:t>
       </w:r>
     </w:p>
     <w:sectPr>

</xml_diff>

<commit_message>
Add career progression line and remove GitHub resume link
</commit_message>
<xml_diff>
--- a/portfolio/public/James_Moorman_Resume.docx
+++ b/portfolio/public/James_Moorman_Resume.docx
@@ -12,7 +12,7 @@
     </w:p>
     <w:p>
       <w:r>
-        <w:t>Eden Prairie, MN | 651-270-4656 | jpmoorman@gmail.com | Portfolio: https://jimmyjames.dev | GitHub: https://github.com/jpmoorman/resume-portfolio</w:t>
+        <w:t>Eden Prairie, MN | 651-270-4656 | jpmoorman@gmail.com | Portfolio: https://jimmyjames.dev</w:t>
       </w:r>
     </w:p>
     <w:p>
@@ -26,6 +26,11 @@
     <w:p>
       <w:r>
         <w:t>AI workflow engineer and internal tools builder with experience designing, shipping, and scaling AI-enabled workflows across CRM-adjacent processes, operational data, document systems, and internal web applications. Hands-on with React, Python, SQL, APIs, LLM-assisted development, prompt frameworks, and automation patterns. Strong record of moving ambiguous business needs from prototype to production, measuring adoption and impact, and creating reusable patterns that reduce manual work across distributed teams.</w:t>
+      </w:r>
+    </w:p>
+    <w:p>
+      <w:r>
+        <w:t>Career foundation spans engineering, product/program management, and operations technology, giving me the context to translate ambiguous business workflows into production internal tools.</w:t>
       </w:r>
     </w:p>
     <w:p>

</xml_diff>